<commit_message>
rapor: code splitting tamamlandı olarak işaretlendi (gap analizi + yol haritası)
</commit_message>
<xml_diff>
--- a/Sagliktan_Mobil_Uyum_Raporu.docx
+++ b/Sagliktan_Mobil_Uyum_Raporu.docx
@@ -1042,7 +1042,7 @@
                 <w:sz w:val="19"/>
                 <w:szCs w:val="19"/>
               </w:rPr>
-              <w:t xml:space="preserve">Tek parça 841 KB JS bundle; route bazlı code splitting yok; tüm sayfalar başlangıçta yükleniyor.</w:t>
+              <w:t xml:space="preserve">ÇÖZÜLDÜ: App.jsx route bazlı React.lazy()+Suspense'e geçirildi. Ana paket 841KB'dan 583KB'a (gzip 254KB-&gt;182KB, hedefin altında) indi; AdminPanel/PostDetail/SendPostDialog gibi ağır sayfalar artık ayrı chunk.</w:t>
             </w:r>
           </w:p>
         </w:tc>
@@ -1068,7 +1068,7 @@
                 <w:sz w:val="19"/>
                 <w:szCs w:val="19"/>
               </w:rPr>
-              <w:t xml:space="preserve">Route bazlı React.lazy() + Suspense; sayfa başına hedef &lt;200KB gzip; vendor/feature chunk ayrımı (manualChunks).</w:t>
+              <w:t xml:space="preserve">Route bazlı React.lazy() + Suspense; sayfa başına hedef &lt;200KB gzip; vendor/feature chunk ayrımı (manualChunks) - kalan iyileştirme fırsatı.</w:t>
             </w:r>
           </w:p>
         </w:tc>
@@ -1757,7 +1757,7 @@
         <w:tc>
           <w:tcPr>
             <w:tcW w:type="dxa" w:w="1400"/>
-            <w:shd w:fill="C0392B" w:color="auto" w:val="clear"/>
+            <w:shd w:fill="4CB89F" w:color="auto" w:val="clear"/>
             <w:tcMar>
               <w:top w:type="dxa" w:w="80"/>
               <w:left w:type="dxa" w:w="100"/>
@@ -1774,10 +1774,10 @@
                 <w:b/>
                 <w:bCs/>
                 <w:color w:val="FFFFFF"/>
-                <w:sz w:val="18"/>
-                <w:szCs w:val="18"/>
-              </w:rPr>
-              <w:t xml:space="preserve">YÜKSEK</w:t>
+                <w:sz w:val="15"/>
+                <w:szCs w:val="15"/>
+              </w:rPr>
+              <w:t xml:space="preserve">TAMAMLANDI</w:t>
             </w:r>
           </w:p>
         </w:tc>
@@ -1803,7 +1803,7 @@
                 <w:sz w:val="19"/>
                 <w:szCs w:val="19"/>
               </w:rPr>
-              <w:t xml:space="preserve">Route bazlı code splitting (React.lazy + Suspense) uygula - 841KB tek bundle, özellikle mobil/zayıf bağlantıda ilk yükleme (LCP) süresini doğrudan etkiliyor.</w:t>
+              <w:t xml:space="preserve">Route bazlı code splitting (React.lazy + Suspense) - 841KB tek bundle, özellikle mobil/zayıf bağlantıda ilk yükleme (LCP) süresini doğrudan etkiliyordu. Ana paket 583KB'a (gzip 182KB) indi.</w:t>
             </w:r>
           </w:p>
         </w:tc>
@@ -1829,7 +1829,7 @@
                 <w:sz w:val="19"/>
                 <w:szCs w:val="19"/>
               </w:rPr>
-              <w:t xml:space="preserve">3-5 gün</w:t>
+              <w:t xml:space="preserve">Tamamlandı</w:t>
             </w:r>
           </w:p>
         </w:tc>
@@ -6863,6 +6863,32 @@
           <w:szCs w:val="21"/>
         </w:rPr>
         <w:t xml:space="preserve">yeni bir usePullToRefresh hook'u yazıldı ve gönderi akışına (Posts.jsx) bağlandı - sayfa en üstteyken aşağı çekince görsel bir gösterge açılıyor ve bırakınca liste yenileniyor.</w:t>
+      </w:r>
+    </w:p>
+    <w:p>
+      <w:pPr>
+        <w:pStyle w:val="ListParagraph"/>
+        <w:numPr>
+          <w:ilvl w:val="0"/>
+          <w:numId w:val="2"/>
+        </w:numPr>
+        <w:spacing w:after="80" w:line="280"/>
+      </w:pPr>
+      <w:r>
+        <w:rPr>
+          <w:b/>
+          <w:bCs/>
+          <w:sz w:val="21"/>
+          <w:szCs w:val="21"/>
+        </w:rPr>
+        <w:t xml:space="preserve">Route bazlı code splitting tamamlandı: </w:t>
+      </w:r>
+      <w:r>
+        <w:rPr>
+          <w:sz w:val="21"/>
+          <w:szCs w:val="21"/>
+        </w:rPr>
+        <w:t xml:space="preserve">App.jsx'teki 14 sayfa React.lazy() + Suspense'e geçirildi (WelcomeScreen ve Login - her oturumun girdiği ilk iki nokta - bilinçli olarak eager bırakıldı). Ana JS paketi 841KB'dan 583KB'a, gzip 254KB'dan 182KB'a indi - roadmap'in kendi hedefi olan "&lt;200KB gzip"in altında. AdminPanel, PostDetail, SendPostDialog gibi ağır sayfalar artık yalnızca o sayfaya gidildiğinde indiriliyor.</w:t>
       </w:r>
     </w:p>
     <w:p>

</xml_diff>